<commit_message>
fix(cache): ignore Redis errors so GET /api/products/<id>/ works without Redis; add Lecture 10 screenshots + DOCX appendix
Made-with: Cursor
</commit_message>
<xml_diff>
--- a/docs/Project_Report_Template_with_Screenshots.docx
+++ b/docs/Project_Report_Template_with_Screenshots.docx
@@ -10435,6 +10435,141 @@
         </w:drawing>
       </w:r>
     </w:p>
+    <w:p/>
+    <w:p>
+      <w:r>
+        <w:rPr>
+          <w:b/>
+        </w:rPr>
+        <w:t>Figure A7 — GET /api/products/health/ — health check (Lecture 10).</w:t>
+      </w:r>
+    </w:p>
+    <w:p>
+      <w:r>
+        <w:drawing>
+          <wp:inline>
+            <wp:extent cx="5715000" cy="2394272"/>
+            <wp:docPr id="10" name="Picture 10"/>
+            <wp:cNvGraphicFramePr>
+              <a:graphicFrameLocks noChangeAspect="1"/>
+            </wp:cNvGraphicFramePr>
+            <a:graphic>
+              <a:graphicData uri="http://schemas.openxmlformats.org/drawingml/2006/picture">
+                <pic:pic>
+                  <pic:nvPicPr>
+                    <pic:cNvPr id="0" name="07-api-products-health.png"/>
+                    <pic:cNvPicPr/>
+                  </pic:nvPicPr>
+                  <pic:blipFill>
+                    <a:blip r:embed="rId19"/>
+                    <a:stretch>
+                      <a:fillRect/>
+                    </a:stretch>
+                  </pic:blipFill>
+                  <pic:spPr>
+                    <a:xfrm>
+                      <a:off x="0" y="0"/>
+                      <a:ext cx="5715000" cy="2394272"/>
+                    </a:xfrm>
+                    <a:prstGeom prst="rect"/>
+                  </pic:spPr>
+                </pic:pic>
+              </a:graphicData>
+            </a:graphic>
+          </wp:inline>
+        </w:drawing>
+      </w:r>
+    </w:p>
+    <w:p/>
+    <w:p>
+      <w:r>
+        <w:rPr>
+          <w:b/>
+        </w:rPr>
+        <w:t>Figure A8 — GET /api/products/search/ returns 405 — search endpoint is POST-only (Lecture 10).</w:t>
+      </w:r>
+    </w:p>
+    <w:p>
+      <w:r>
+        <w:drawing>
+          <wp:inline>
+            <wp:extent cx="5715000" cy="3164458"/>
+            <wp:docPr id="11" name="Picture 11"/>
+            <wp:cNvGraphicFramePr>
+              <a:graphicFrameLocks noChangeAspect="1"/>
+            </wp:cNvGraphicFramePr>
+            <a:graphic>
+              <a:graphicData uri="http://schemas.openxmlformats.org/drawingml/2006/picture">
+                <pic:pic>
+                  <pic:nvPicPr>
+                    <pic:cNvPr id="0" name="08-api-products-search-get-405.png"/>
+                    <pic:cNvPicPr/>
+                  </pic:nvPicPr>
+                  <pic:blipFill>
+                    <a:blip r:embed="rId20"/>
+                    <a:stretch>
+                      <a:fillRect/>
+                    </a:stretch>
+                  </pic:blipFill>
+                  <pic:spPr>
+                    <a:xfrm>
+                      <a:off x="0" y="0"/>
+                      <a:ext cx="5715000" cy="3164458"/>
+                    </a:xfrm>
+                    <a:prstGeom prst="rect"/>
+                  </pic:spPr>
+                </pic:pic>
+              </a:graphicData>
+            </a:graphic>
+          </wp:inline>
+        </w:drawing>
+      </w:r>
+    </w:p>
+    <w:p/>
+    <w:p>
+      <w:r>
+        <w:rPr>
+          <w:b/>
+        </w:rPr>
+        <w:t>Figure A9 — POST /api/products/search/ — pagination &amp; search results (Lecture 10).</w:t>
+      </w:r>
+    </w:p>
+    <w:p>
+      <w:r>
+        <w:drawing>
+          <wp:inline>
+            <wp:extent cx="5715000" cy="4459263"/>
+            <wp:docPr id="12" name="Picture 12"/>
+            <wp:cNvGraphicFramePr>
+              <a:graphicFrameLocks noChangeAspect="1"/>
+            </wp:cNvGraphicFramePr>
+            <a:graphic>
+              <a:graphicData uri="http://schemas.openxmlformats.org/drawingml/2006/picture">
+                <pic:pic>
+                  <pic:nvPicPr>
+                    <pic:cNvPr id="0" name="09-api-products-search-post-200.png"/>
+                    <pic:cNvPicPr/>
+                  </pic:nvPicPr>
+                  <pic:blipFill>
+                    <a:blip r:embed="rId21"/>
+                    <a:stretch>
+                      <a:fillRect/>
+                    </a:stretch>
+                  </pic:blipFill>
+                  <pic:spPr>
+                    <a:xfrm>
+                      <a:off x="0" y="0"/>
+                      <a:ext cx="5715000" cy="4459263"/>
+                    </a:xfrm>
+                    <a:prstGeom prst="rect"/>
+                  </pic:spPr>
+                </pic:pic>
+              </a:graphicData>
+            </a:graphic>
+          </wp:inline>
+        </w:drawing>
+      </w:r>
+    </w:p>
     <w:sectPr>
       <w:headerReference r:id="rId9" w:type="default"/>
       <w:headerReference r:id="rId10" w:type="first"/>

</xml_diff>

<commit_message>
docs: add GET /api/products/<id>/ screenshot and Word appendix Figure A10
Made-with: Cursor
</commit_message>
<xml_diff>
--- a/docs/Project_Report_Template_with_Screenshots.docx
+++ b/docs/Project_Report_Template_with_Screenshots.docx
@@ -10570,6 +10570,51 @@
         </w:drawing>
       </w:r>
     </w:p>
+    <w:p/>
+    <w:p>
+      <w:r>
+        <w:rPr>
+          <w:b/>
+        </w:rPr>
+        <w:t>Figure A10 — GET /api/products/1/ — product detail with Redis caching (Lectures 1 &amp; 10).</w:t>
+      </w:r>
+    </w:p>
+    <w:p>
+      <w:r>
+        <w:drawing>
+          <wp:inline>
+            <wp:extent cx="5715000" cy="2371948"/>
+            <wp:docPr id="13" name="Picture 13"/>
+            <wp:cNvGraphicFramePr>
+              <a:graphicFrameLocks noChangeAspect="1"/>
+            </wp:cNvGraphicFramePr>
+            <a:graphic>
+              <a:graphicData uri="http://schemas.openxmlformats.org/drawingml/2006/picture">
+                <pic:pic>
+                  <pic:nvPicPr>
+                    <pic:cNvPr id="0" name="10-api-product-detail-get.png"/>
+                    <pic:cNvPicPr/>
+                  </pic:nvPicPr>
+                  <pic:blipFill>
+                    <a:blip r:embed="rId22"/>
+                    <a:stretch>
+                      <a:fillRect/>
+                    </a:stretch>
+                  </pic:blipFill>
+                  <pic:spPr>
+                    <a:xfrm>
+                      <a:off x="0" y="0"/>
+                      <a:ext cx="5715000" cy="2371948"/>
+                    </a:xfrm>
+                    <a:prstGeom prst="rect"/>
+                  </pic:spPr>
+                </pic:pic>
+              </a:graphicData>
+            </a:graphic>
+          </wp:inline>
+        </w:drawing>
+      </w:r>
+    </w:p>
     <w:sectPr>
       <w:headerReference r:id="rId9" w:type="default"/>
       <w:headerReference r:id="rId10" w:type="first"/>

</xml_diff>